<commit_message>
modify table view , bind toggle for shop view,
Lưu reload bbnt tại trang, đổi tên thành in hợp đồng

File word BBNT đổi thành Tên SP, cho nhỏ lại table

Sửa lại hiển thị note ở SHOP khi edit

fix lại sđt của admin trogn DB
</commit_message>
<xml_diff>
--- a/storage/app/templates/bbnt_template.docx
+++ b/storage/app/templates/bbnt_template.docx
@@ -1,6 +1,6 @@
 
 <file path=word/document.xml><?xml version="1.0" encoding="utf-8"?>
-<w:document xmlns:wpc="http://schemas.microsoft.com/office/word/2010/wordprocessingCanvas" xmlns:cx="http://schemas.microsoft.com/office/drawing/2014/chartex" xmlns:mc="http://schemas.openxmlformats.org/markup-compatibility/2006" xmlns:o="urn:schemas-microsoft-com:office:office" xmlns:r="http://schemas.openxmlformats.org/officeDocument/2006/relationships" xmlns:m="http://schemas.openxmlformats.org/officeDocument/2006/math" xmlns:v="urn:schemas-microsoft-com:vml" xmlns:wp14="http://schemas.microsoft.com/office/word/2010/wordprocessingDrawing" xmlns:wp="http://schemas.openxmlformats.org/drawingml/2006/wordprocessingDrawing" xmlns:w10="urn:schemas-microsoft-com:office:word" xmlns:w="http://schemas.openxmlformats.org/wordprocessingml/2006/main" xmlns:w14="http://schemas.microsoft.com/office/word/2010/wordml" xmlns:w15="http://schemas.microsoft.com/office/word/2012/wordml" xmlns:w16se="http://schemas.microsoft.com/office/word/2015/wordml/symex" xmlns:wpg="http://schemas.microsoft.com/office/word/2010/wordprocessingGroup" xmlns:wpi="http://schemas.microsoft.com/office/word/2010/wordprocessingInk" xmlns:wne="http://schemas.microsoft.com/office/word/2006/wordml" xmlns:wps="http://schemas.microsoft.com/office/word/2010/wordprocessingShape" mc:Ignorable="w14 w15 w16se wp14">
+<w:document xmlns:wpc="http://schemas.microsoft.com/office/word/2010/wordprocessingCanvas" xmlns:cx="http://schemas.microsoft.com/office/drawing/2014/chartex" xmlns:cx1="http://schemas.microsoft.com/office/drawing/2015/9/8/chartex" xmlns:cx2="http://schemas.microsoft.com/office/drawing/2015/10/21/chartex" xmlns:cx3="http://schemas.microsoft.com/office/drawing/2016/5/9/chartex" xmlns:cx4="http://schemas.microsoft.com/office/drawing/2016/5/10/chartex" xmlns:cx5="http://schemas.microsoft.com/office/drawing/2016/5/11/chartex" xmlns:cx6="http://schemas.microsoft.com/office/drawing/2016/5/12/chartex" xmlns:cx7="http://schemas.microsoft.com/office/drawing/2016/5/13/chartex" xmlns:cx8="http://schemas.microsoft.com/office/drawing/2016/5/14/chartex" xmlns:mc="http://schemas.openxmlformats.org/markup-compatibility/2006" xmlns:aink="http://schemas.microsoft.com/office/drawing/2016/ink" xmlns:am3d="http://schemas.microsoft.com/office/drawing/2017/model3d" xmlns:o="urn:schemas-microsoft-com:office:office" xmlns:oel="http://schemas.microsoft.com/office/2019/extlst" xmlns:r="http://schemas.openxmlformats.org/officeDocument/2006/relationships" xmlns:m="http://schemas.openxmlformats.org/officeDocument/2006/math" xmlns:v="urn:schemas-microsoft-com:vml" xmlns:wp14="http://schemas.microsoft.com/office/word/2010/wordprocessingDrawing" xmlns:wp="http://schemas.openxmlformats.org/drawingml/2006/wordprocessingDrawing" xmlns:w10="urn:schemas-microsoft-com:office:word" xmlns:w="http://schemas.openxmlformats.org/wordprocessingml/2006/main" xmlns:w14="http://schemas.microsoft.com/office/word/2010/wordml" xmlns:w15="http://schemas.microsoft.com/office/word/2012/wordml" xmlns:w16cex="http://schemas.microsoft.com/office/word/2018/wordml/cex" xmlns:w16cid="http://schemas.microsoft.com/office/word/2016/wordml/cid" xmlns:w16="http://schemas.microsoft.com/office/word/2018/wordml" xmlns:w16du="http://schemas.microsoft.com/office/word/2023/wordml/word16du" xmlns:w16sdtdh="http://schemas.microsoft.com/office/word/2020/wordml/sdtdatahash" xmlns:w16sdtfl="http://schemas.microsoft.com/office/word/2024/wordml/sdtformatlock" xmlns:w16se="http://schemas.microsoft.com/office/word/2015/wordml/symex" xmlns:wpg="http://schemas.microsoft.com/office/word/2010/wordprocessingGroup" xmlns:wpi="http://schemas.microsoft.com/office/word/2010/wordprocessingInk" xmlns:wne="http://schemas.microsoft.com/office/word/2006/wordml" xmlns:wps="http://schemas.microsoft.com/office/word/2010/wordprocessingShape" mc:Ignorable="w14 w15 w16se w16cid w16 w16cex w16sdtdh w16sdtfl w16du wp14">
   <w:body>
     <w:p>
       <w:pPr>
@@ -125,18 +125,44 @@
           <w:sz w:val="24"/>
           <w:szCs w:val="24"/>
         </w:rPr>
+        <w:t>${ngay}</w:t>
+      </w:r>
+      <w:r>
+        <w:rPr>
+          <w:rFonts w:ascii="Times New Roman" w:hAnsi="Times New Roman" w:cs="Times New Roman"/>
+          <w:sz w:val="24"/>
+          <w:szCs w:val="24"/>
+        </w:rPr>
+        <w:t xml:space="preserve"> </w:t>
+      </w:r>
+      <w:r>
+        <w:rPr>
+          <w:rFonts w:ascii="Times New Roman" w:hAnsi="Times New Roman" w:cs="Times New Roman"/>
+          <w:sz w:val="24"/>
+          <w:szCs w:val="24"/>
+          <w:lang w:val="vi-VN"/>
+        </w:rPr>
+        <w:t>tháng</w:t>
+      </w:r>
+      <w:r>
+        <w:rPr>
+          <w:rFonts w:ascii="Times New Roman" w:hAnsi="Times New Roman" w:cs="Times New Roman"/>
+          <w:sz w:val="24"/>
+          <w:szCs w:val="24"/>
+        </w:rPr>
+        <w:t xml:space="preserve"> </w:t>
+      </w:r>
+      <w:r>
+        <w:rPr>
+          <w:rFonts w:ascii="Times New Roman" w:hAnsi="Times New Roman" w:cs="Times New Roman"/>
+          <w:sz w:val="24"/>
+          <w:szCs w:val="24"/>
+        </w:rPr>
         <w:t>${</w:t>
       </w:r>
-      <w:proofErr w:type="spellStart"/>
-      <w:r>
-        <w:rPr>
-          <w:rFonts w:ascii="Times New Roman" w:hAnsi="Times New Roman" w:cs="Times New Roman"/>
-          <w:sz w:val="24"/>
-          <w:szCs w:val="24"/>
-        </w:rPr>
-        <w:t>ngay</w:t>
-      </w:r>
-      <w:proofErr w:type="spellEnd"/>
+      <w:r>
+        <w:t>thang</w:t>
+      </w:r>
       <w:r>
         <w:rPr>
           <w:rFonts w:ascii="Times New Roman" w:hAnsi="Times New Roman" w:cs="Times New Roman"/>
@@ -160,7 +186,7 @@
           <w:szCs w:val="24"/>
           <w:lang w:val="vi-VN"/>
         </w:rPr>
-        <w:t>tháng</w:t>
+        <w:t>năm</w:t>
       </w:r>
       <w:r>
         <w:rPr>
@@ -179,51 +205,6 @@
         <w:t>${</w:t>
       </w:r>
       <w:r>
-        <w:t>thang</w:t>
-      </w:r>
-      <w:r>
-        <w:rPr>
-          <w:rFonts w:ascii="Times New Roman" w:hAnsi="Times New Roman" w:cs="Times New Roman"/>
-          <w:sz w:val="24"/>
-          <w:szCs w:val="24"/>
-        </w:rPr>
-        <w:t>}</w:t>
-      </w:r>
-      <w:r>
-        <w:rPr>
-          <w:rFonts w:ascii="Times New Roman" w:hAnsi="Times New Roman" w:cs="Times New Roman"/>
-          <w:sz w:val="24"/>
-          <w:szCs w:val="24"/>
-        </w:rPr>
-        <w:t xml:space="preserve"> </w:t>
-      </w:r>
-      <w:r>
-        <w:rPr>
-          <w:rFonts w:ascii="Times New Roman" w:hAnsi="Times New Roman" w:cs="Times New Roman"/>
-          <w:sz w:val="24"/>
-          <w:szCs w:val="24"/>
-          <w:lang w:val="vi-VN"/>
-        </w:rPr>
-        <w:t>năm</w:t>
-      </w:r>
-      <w:r>
-        <w:rPr>
-          <w:rFonts w:ascii="Times New Roman" w:hAnsi="Times New Roman" w:cs="Times New Roman"/>
-          <w:sz w:val="24"/>
-          <w:szCs w:val="24"/>
-        </w:rPr>
-        <w:t xml:space="preserve"> </w:t>
-      </w:r>
-      <w:r>
-        <w:rPr>
-          <w:rFonts w:ascii="Times New Roman" w:hAnsi="Times New Roman" w:cs="Times New Roman"/>
-          <w:sz w:val="24"/>
-          <w:szCs w:val="24"/>
-        </w:rPr>
-        <w:t>${</w:t>
-      </w:r>
-      <w:proofErr w:type="spellStart"/>
-      <w:r>
         <w:rPr>
           <w:rFonts w:ascii="Times New Roman" w:hAnsi="Times New Roman" w:cs="Times New Roman"/>
           <w:sz w:val="24"/>
@@ -231,7 +212,6 @@
         </w:rPr>
         <w:t>nam</w:t>
       </w:r>
-      <w:proofErr w:type="spellEnd"/>
       <w:r>
         <w:rPr>
           <w:rFonts w:ascii="Times New Roman" w:hAnsi="Times New Roman" w:cs="Times New Roman"/>
@@ -278,51 +258,6 @@
           <w:szCs w:val="24"/>
         </w:rPr>
         <w:t>{address}</w:t>
-      </w:r>
-    </w:p>
-    <w:p>
-      <w:pPr>
-        <w:spacing w:after="120"/>
-        <w:ind w:left="1134"/>
-        <w:rPr>
-          <w:rFonts w:ascii="Times New Roman" w:hAnsi="Times New Roman" w:cs="Times New Roman"/>
-          <w:b/>
-          <w:bCs/>
-          <w:sz w:val="28"/>
-          <w:szCs w:val="28"/>
-        </w:rPr>
-      </w:pPr>
-      <w:r>
-        <w:rPr>
-          <w:rFonts w:ascii="Times New Roman" w:hAnsi="Times New Roman" w:cs="Times New Roman"/>
-          <w:b/>
-          <w:bCs/>
-          <w:sz w:val="24"/>
-          <w:szCs w:val="24"/>
-        </w:rPr>
-        <w:t>${</w:t>
-      </w:r>
-      <w:proofErr w:type="spellStart"/>
-      <w:r>
-        <w:rPr>
-          <w:rFonts w:ascii="Times New Roman" w:hAnsi="Times New Roman" w:cs="Times New Roman"/>
-          <w:b/>
-          <w:bCs/>
-          <w:sz w:val="24"/>
-          <w:szCs w:val="24"/>
-        </w:rPr>
-        <w:t>shop_name</w:t>
-      </w:r>
-      <w:proofErr w:type="spellEnd"/>
-      <w:r>
-        <w:rPr>
-          <w:rFonts w:ascii="Times New Roman" w:hAnsi="Times New Roman" w:cs="Times New Roman"/>
-          <w:b/>
-          <w:bCs/>
-          <w:sz w:val="24"/>
-          <w:szCs w:val="24"/>
-        </w:rPr>
-        <w:t>}</w:t>
       </w:r>
     </w:p>
     <w:p>
@@ -509,29 +444,7 @@
           <w:sz w:val="24"/>
           <w:szCs w:val="24"/>
         </w:rPr>
-        <w:t>${</w:t>
-      </w:r>
-      <w:proofErr w:type="spellStart"/>
-      <w:r>
-        <w:rPr>
-          <w:rFonts w:ascii="Times New Roman" w:hAnsi="Times New Roman" w:cs="Times New Roman"/>
-          <w:b/>
-          <w:bCs/>
-          <w:sz w:val="24"/>
-          <w:szCs w:val="24"/>
-        </w:rPr>
-        <w:t>shop_name</w:t>
-      </w:r>
-      <w:proofErr w:type="spellEnd"/>
-      <w:r>
-        <w:rPr>
-          <w:rFonts w:ascii="Times New Roman" w:hAnsi="Times New Roman" w:cs="Times New Roman"/>
-          <w:b/>
-          <w:bCs/>
-          <w:sz w:val="24"/>
-          <w:szCs w:val="24"/>
-        </w:rPr>
-        <w:t>}</w:t>
+        <w:t>${shop_name}</w:t>
       </w:r>
     </w:p>
     <w:p>
@@ -565,7 +478,6 @@
         </w:rPr>
         <w:t>: ${</w:t>
       </w:r>
-      <w:proofErr w:type="spellStart"/>
       <w:r>
         <w:rPr>
           <w:rFonts w:ascii="Times New Roman" w:hAnsi="Times New Roman" w:cs="Times New Roman"/>
@@ -574,7 +486,6 @@
         </w:rPr>
         <w:t>customer_name_contract</w:t>
       </w:r>
-      <w:proofErr w:type="spellEnd"/>
       <w:r>
         <w:rPr>
           <w:rFonts w:ascii="Times New Roman" w:hAnsi="Times New Roman" w:cs="Times New Roman"/>
@@ -608,23 +519,13 @@
         </w:rPr>
         <w:t xml:space="preserve"> ${</w:t>
       </w:r>
-      <w:proofErr w:type="spellStart"/>
-      <w:r>
-        <w:rPr>
-          <w:rFonts w:ascii="Times New Roman" w:hAnsi="Times New Roman" w:cs="Times New Roman"/>
-          <w:sz w:val="24"/>
-          <w:szCs w:val="24"/>
-        </w:rPr>
-        <w:t>customer_position</w:t>
-      </w:r>
-      <w:proofErr w:type="spellEnd"/>
-      <w:r>
-        <w:rPr>
-          <w:rFonts w:ascii="Times New Roman" w:hAnsi="Times New Roman" w:cs="Times New Roman"/>
-          <w:sz w:val="24"/>
-          <w:szCs w:val="24"/>
-        </w:rPr>
-        <w:t xml:space="preserve">} </w:t>
+      <w:r>
+        <w:rPr>
+          <w:rFonts w:ascii="Times New Roman" w:hAnsi="Times New Roman" w:cs="Times New Roman"/>
+          <w:sz w:val="24"/>
+          <w:szCs w:val="24"/>
+        </w:rPr>
+        <w:t xml:space="preserve">customer_position} </w:t>
       </w:r>
       <w:r>
         <w:rPr>
@@ -676,7 +577,7 @@
       </w:tblGrid>
       <w:tr>
         <w:trPr>
-          <w:trHeight w:val="539"/>
+          <w:trHeight w:val="386"/>
           <w:jc w:val="center"/>
         </w:trPr>
         <w:tc>
@@ -725,7 +626,6 @@
                 <w:bCs/>
                 <w:sz w:val="24"/>
                 <w:szCs w:val="24"/>
-                <w:lang w:val="vi-VN"/>
               </w:rPr>
             </w:pPr>
             <w:r>
@@ -737,7 +637,17 @@
                 <w:szCs w:val="24"/>
                 <w:lang w:val="vi-VN"/>
               </w:rPr>
-              <w:t>Tên, nhãn hiệu, quy cách, phẩm chất vật tư, dụng cụ sản phẩm, hàng hóa</w:t>
+              <w:t>Tên</w:t>
+            </w:r>
+            <w:r>
+              <w:rPr>
+                <w:rFonts w:ascii="Times New Roman" w:hAnsi="Times New Roman" w:cs="Times New Roman"/>
+                <w:b/>
+                <w:bCs/>
+                <w:sz w:val="24"/>
+                <w:szCs w:val="24"/>
+              </w:rPr>
+              <w:t xml:space="preserve"> SP</w:t>
             </w:r>
           </w:p>
         </w:tc>
@@ -872,7 +782,7 @@
       </w:tr>
       <w:tr>
         <w:trPr>
-          <w:trHeight w:val="539"/>
+          <w:trHeight w:val="260"/>
           <w:jc w:val="center"/>
         </w:trPr>
         <w:tc>
@@ -921,25 +831,7 @@
                 <w:sz w:val="24"/>
                 <w:szCs w:val="24"/>
               </w:rPr>
-              <w:t>${</w:t>
-            </w:r>
-            <w:proofErr w:type="spellStart"/>
-            <w:r>
-              <w:rPr>
-                <w:rFonts w:ascii="Times New Roman" w:hAnsi="Times New Roman" w:cs="Times New Roman"/>
-                <w:sz w:val="24"/>
-                <w:szCs w:val="24"/>
-              </w:rPr>
-              <w:t>dn</w:t>
-            </w:r>
-            <w:proofErr w:type="spellEnd"/>
-            <w:r>
-              <w:rPr>
-                <w:rFonts w:ascii="Times New Roman" w:hAnsi="Times New Roman" w:cs="Times New Roman"/>
-                <w:sz w:val="24"/>
-                <w:szCs w:val="24"/>
-              </w:rPr>
-              <w:t>}</w:t>
+              <w:t>${dn}</w:t>
             </w:r>
           </w:p>
         </w:tc>
@@ -1017,25 +909,7 @@
                 <w:sz w:val="24"/>
                 <w:szCs w:val="24"/>
               </w:rPr>
-              <w:t>${</w:t>
-            </w:r>
-            <w:proofErr w:type="spellStart"/>
-            <w:r>
-              <w:rPr>
-                <w:rFonts w:ascii="Times New Roman" w:hAnsi="Times New Roman" w:cs="Times New Roman"/>
-                <w:sz w:val="24"/>
-                <w:szCs w:val="24"/>
-              </w:rPr>
-              <w:t>qty</w:t>
-            </w:r>
-            <w:proofErr w:type="spellEnd"/>
-            <w:r>
-              <w:rPr>
-                <w:rFonts w:ascii="Times New Roman" w:hAnsi="Times New Roman" w:cs="Times New Roman"/>
-                <w:sz w:val="24"/>
-                <w:szCs w:val="24"/>
-              </w:rPr>
-              <w:t>}</w:t>
+              <w:t>${qty}</w:t>
             </w:r>
           </w:p>
         </w:tc>
@@ -1061,25 +935,7 @@
                 <w:sz w:val="24"/>
                 <w:szCs w:val="24"/>
               </w:rPr>
-              <w:t>${</w:t>
-            </w:r>
-            <w:proofErr w:type="spellStart"/>
-            <w:r>
-              <w:rPr>
-                <w:rFonts w:ascii="Times New Roman" w:hAnsi="Times New Roman" w:cs="Times New Roman"/>
-                <w:sz w:val="24"/>
-                <w:szCs w:val="24"/>
-              </w:rPr>
-              <w:t>dnote</w:t>
-            </w:r>
-            <w:proofErr w:type="spellEnd"/>
-            <w:r>
-              <w:rPr>
-                <w:rFonts w:ascii="Times New Roman" w:hAnsi="Times New Roman" w:cs="Times New Roman"/>
-                <w:sz w:val="24"/>
-                <w:szCs w:val="24"/>
-              </w:rPr>
-              <w:t>}</w:t>
+              <w:t>${dnote}</w:t>
             </w:r>
           </w:p>
         </w:tc>
@@ -1092,219 +948,20 @@
           <w:ilvl w:val="0"/>
           <w:numId w:val="3"/>
         </w:numPr>
-        <w:rPr>
-          <w:rFonts w:ascii="Times New Roman" w:hAnsi="Times New Roman" w:cs="Times New Roman"/>
-          <w:sz w:val="24"/>
-          <w:szCs w:val="24"/>
-        </w:rPr>
-      </w:pPr>
-      <w:proofErr w:type="spellStart"/>
-      <w:r>
-        <w:rPr>
-          <w:rFonts w:ascii="Times New Roman" w:hAnsi="Times New Roman" w:cs="Times New Roman"/>
-          <w:sz w:val="24"/>
-          <w:szCs w:val="24"/>
-        </w:rPr>
-        <w:t>Thời</w:t>
-      </w:r>
-      <w:proofErr w:type="spellEnd"/>
-      <w:r>
-        <w:rPr>
-          <w:rFonts w:ascii="Times New Roman" w:hAnsi="Times New Roman" w:cs="Times New Roman"/>
-          <w:sz w:val="24"/>
-          <w:szCs w:val="24"/>
-        </w:rPr>
-        <w:t xml:space="preserve"> </w:t>
-      </w:r>
-      <w:proofErr w:type="spellStart"/>
-      <w:r>
-        <w:rPr>
-          <w:rFonts w:ascii="Times New Roman" w:hAnsi="Times New Roman" w:cs="Times New Roman"/>
-          <w:sz w:val="24"/>
-          <w:szCs w:val="24"/>
-        </w:rPr>
-        <w:t>gian</w:t>
-      </w:r>
-      <w:proofErr w:type="spellEnd"/>
-      <w:r>
-        <w:rPr>
-          <w:rFonts w:ascii="Times New Roman" w:hAnsi="Times New Roman" w:cs="Times New Roman"/>
-          <w:sz w:val="24"/>
-          <w:szCs w:val="24"/>
-        </w:rPr>
-        <w:t xml:space="preserve"> </w:t>
-      </w:r>
-      <w:proofErr w:type="spellStart"/>
-      <w:r>
-        <w:rPr>
-          <w:rFonts w:ascii="Times New Roman" w:hAnsi="Times New Roman" w:cs="Times New Roman"/>
-          <w:sz w:val="24"/>
-          <w:szCs w:val="24"/>
-        </w:rPr>
-        <w:t>hoàn</w:t>
-      </w:r>
-      <w:proofErr w:type="spellEnd"/>
-      <w:r>
-        <w:rPr>
-          <w:rFonts w:ascii="Times New Roman" w:hAnsi="Times New Roman" w:cs="Times New Roman"/>
-          <w:sz w:val="24"/>
-          <w:szCs w:val="24"/>
-        </w:rPr>
-        <w:t xml:space="preserve"> </w:t>
-      </w:r>
-      <w:proofErr w:type="spellStart"/>
-      <w:r>
-        <w:rPr>
-          <w:rFonts w:ascii="Times New Roman" w:hAnsi="Times New Roman" w:cs="Times New Roman"/>
-          <w:sz w:val="24"/>
-          <w:szCs w:val="24"/>
-        </w:rPr>
-        <w:t>thành</w:t>
-      </w:r>
-      <w:proofErr w:type="spellEnd"/>
-      <w:r>
-        <w:rPr>
-          <w:rFonts w:ascii="Times New Roman" w:hAnsi="Times New Roman" w:cs="Times New Roman"/>
-          <w:sz w:val="24"/>
-          <w:szCs w:val="24"/>
-        </w:rPr>
-        <w:t xml:space="preserve"> </w:t>
-      </w:r>
-      <w:proofErr w:type="spellStart"/>
-      <w:r>
-        <w:rPr>
-          <w:rFonts w:ascii="Times New Roman" w:hAnsi="Times New Roman" w:cs="Times New Roman"/>
-          <w:sz w:val="24"/>
-          <w:szCs w:val="24"/>
-        </w:rPr>
-        <w:t>lắp</w:t>
-      </w:r>
-      <w:proofErr w:type="spellEnd"/>
-      <w:r>
-        <w:rPr>
-          <w:rFonts w:ascii="Times New Roman" w:hAnsi="Times New Roman" w:cs="Times New Roman"/>
-          <w:sz w:val="24"/>
-          <w:szCs w:val="24"/>
-        </w:rPr>
-        <w:t xml:space="preserve"> </w:t>
-      </w:r>
-      <w:proofErr w:type="spellStart"/>
-      <w:r>
-        <w:rPr>
-          <w:rFonts w:ascii="Times New Roman" w:hAnsi="Times New Roman" w:cs="Times New Roman"/>
-          <w:sz w:val="24"/>
-          <w:szCs w:val="24"/>
-        </w:rPr>
-        <w:t>đặt</w:t>
-      </w:r>
-      <w:proofErr w:type="spellEnd"/>
-      <w:r>
-        <w:rPr>
-          <w:rFonts w:ascii="Times New Roman" w:hAnsi="Times New Roman" w:cs="Times New Roman"/>
-          <w:sz w:val="24"/>
-          <w:szCs w:val="24"/>
-        </w:rPr>
-        <w:t xml:space="preserve"> </w:t>
-      </w:r>
-      <w:proofErr w:type="spellStart"/>
-      <w:r>
-        <w:rPr>
-          <w:rFonts w:ascii="Times New Roman" w:hAnsi="Times New Roman" w:cs="Times New Roman"/>
-          <w:sz w:val="24"/>
-          <w:szCs w:val="24"/>
-        </w:rPr>
-        <w:t>và</w:t>
-      </w:r>
-      <w:proofErr w:type="spellEnd"/>
-      <w:r>
-        <w:rPr>
-          <w:rFonts w:ascii="Times New Roman" w:hAnsi="Times New Roman" w:cs="Times New Roman"/>
-          <w:sz w:val="24"/>
-          <w:szCs w:val="24"/>
-        </w:rPr>
-        <w:t xml:space="preserve"> </w:t>
-      </w:r>
-      <w:proofErr w:type="spellStart"/>
-      <w:r>
-        <w:rPr>
-          <w:rFonts w:ascii="Times New Roman" w:hAnsi="Times New Roman" w:cs="Times New Roman"/>
-          <w:sz w:val="24"/>
-          <w:szCs w:val="24"/>
-        </w:rPr>
-        <w:t>đưa</w:t>
-      </w:r>
-      <w:proofErr w:type="spellEnd"/>
-      <w:r>
-        <w:rPr>
-          <w:rFonts w:ascii="Times New Roman" w:hAnsi="Times New Roman" w:cs="Times New Roman"/>
-          <w:sz w:val="24"/>
-          <w:szCs w:val="24"/>
-        </w:rPr>
-        <w:t xml:space="preserve"> </w:t>
-      </w:r>
-      <w:proofErr w:type="spellStart"/>
-      <w:r>
-        <w:rPr>
-          <w:rFonts w:ascii="Times New Roman" w:hAnsi="Times New Roman" w:cs="Times New Roman"/>
-          <w:sz w:val="24"/>
-          <w:szCs w:val="24"/>
-        </w:rPr>
-        <w:t>vào</w:t>
-      </w:r>
-      <w:proofErr w:type="spellEnd"/>
-      <w:r>
-        <w:rPr>
-          <w:rFonts w:ascii="Times New Roman" w:hAnsi="Times New Roman" w:cs="Times New Roman"/>
-          <w:sz w:val="24"/>
-          <w:szCs w:val="24"/>
-        </w:rPr>
-        <w:t xml:space="preserve"> </w:t>
-      </w:r>
-      <w:proofErr w:type="spellStart"/>
-      <w:r>
-        <w:rPr>
-          <w:rFonts w:ascii="Times New Roman" w:hAnsi="Times New Roman" w:cs="Times New Roman"/>
-          <w:sz w:val="24"/>
-          <w:szCs w:val="24"/>
-        </w:rPr>
-        <w:t>sử</w:t>
-      </w:r>
-      <w:proofErr w:type="spellEnd"/>
-      <w:r>
-        <w:rPr>
-          <w:rFonts w:ascii="Times New Roman" w:hAnsi="Times New Roman" w:cs="Times New Roman"/>
-          <w:sz w:val="24"/>
-          <w:szCs w:val="24"/>
-        </w:rPr>
-        <w:t xml:space="preserve"> </w:t>
-      </w:r>
-      <w:proofErr w:type="spellStart"/>
-      <w:proofErr w:type="gramStart"/>
-      <w:r>
-        <w:rPr>
-          <w:rFonts w:ascii="Times New Roman" w:hAnsi="Times New Roman" w:cs="Times New Roman"/>
-          <w:sz w:val="24"/>
-          <w:szCs w:val="24"/>
-        </w:rPr>
-        <w:t>dụng</w:t>
-      </w:r>
-      <w:proofErr w:type="spellEnd"/>
-      <w:r>
-        <w:rPr>
-          <w:rFonts w:ascii="Times New Roman" w:hAnsi="Times New Roman" w:cs="Times New Roman"/>
-          <w:sz w:val="24"/>
-          <w:szCs w:val="24"/>
-        </w:rPr>
-        <w:t>:…</w:t>
-      </w:r>
-      <w:proofErr w:type="gramEnd"/>
-      <w:r>
-        <w:rPr>
-          <w:rFonts w:ascii="Times New Roman" w:hAnsi="Times New Roman" w:cs="Times New Roman"/>
-          <w:sz w:val="24"/>
-          <w:szCs w:val="24"/>
-        </w:rPr>
-        <w:t>./……/2025</w:t>
+        <w:jc w:val="both"/>
+        <w:rPr>
+          <w:rFonts w:ascii="Times New Roman" w:hAnsi="Times New Roman" w:cs="Times New Roman"/>
+          <w:sz w:val="24"/>
+          <w:szCs w:val="24"/>
+        </w:rPr>
+      </w:pPr>
+      <w:r>
+        <w:rPr>
+          <w:rFonts w:ascii="Times New Roman" w:hAnsi="Times New Roman" w:cs="Times New Roman"/>
+          <w:sz w:val="24"/>
+          <w:szCs w:val="24"/>
+        </w:rPr>
+        <w:t>Thời gian hoàn thành lắp đặt và đưa vào sử dụng:…./……/2025</w:t>
       </w:r>
     </w:p>
     <w:p>
@@ -1315,101 +972,20 @@
           <w:numId w:val="3"/>
         </w:numPr>
         <w:ind w:left="1134" w:firstLine="0"/>
-        <w:rPr>
-          <w:rFonts w:ascii="Times New Roman" w:hAnsi="Times New Roman" w:cs="Times New Roman"/>
-          <w:sz w:val="24"/>
-          <w:szCs w:val="24"/>
-        </w:rPr>
-      </w:pPr>
-      <w:r>
-        <w:rPr>
-          <w:rFonts w:ascii="Times New Roman" w:hAnsi="Times New Roman" w:cs="Times New Roman"/>
-          <w:sz w:val="24"/>
-          <w:szCs w:val="24"/>
-        </w:rPr>
-        <w:t xml:space="preserve"> </w:t>
-      </w:r>
-      <w:proofErr w:type="spellStart"/>
-      <w:r>
-        <w:rPr>
-          <w:rFonts w:ascii="Times New Roman" w:hAnsi="Times New Roman" w:cs="Times New Roman"/>
-          <w:sz w:val="24"/>
-          <w:szCs w:val="24"/>
-        </w:rPr>
-        <w:t>Tình</w:t>
-      </w:r>
-      <w:proofErr w:type="spellEnd"/>
-      <w:r>
-        <w:rPr>
-          <w:rFonts w:ascii="Times New Roman" w:hAnsi="Times New Roman" w:cs="Times New Roman"/>
-          <w:sz w:val="24"/>
-          <w:szCs w:val="24"/>
-        </w:rPr>
-        <w:t xml:space="preserve"> </w:t>
-      </w:r>
-      <w:proofErr w:type="spellStart"/>
-      <w:r>
-        <w:rPr>
-          <w:rFonts w:ascii="Times New Roman" w:hAnsi="Times New Roman" w:cs="Times New Roman"/>
-          <w:sz w:val="24"/>
-          <w:szCs w:val="24"/>
-        </w:rPr>
-        <w:t>trạng</w:t>
-      </w:r>
-      <w:proofErr w:type="spellEnd"/>
-      <w:r>
-        <w:rPr>
-          <w:rFonts w:ascii="Times New Roman" w:hAnsi="Times New Roman" w:cs="Times New Roman"/>
-          <w:sz w:val="24"/>
-          <w:szCs w:val="24"/>
-        </w:rPr>
-        <w:t xml:space="preserve"> </w:t>
-      </w:r>
-      <w:proofErr w:type="spellStart"/>
-      <w:r>
-        <w:rPr>
-          <w:rFonts w:ascii="Times New Roman" w:hAnsi="Times New Roman" w:cs="Times New Roman"/>
-          <w:sz w:val="24"/>
-          <w:szCs w:val="24"/>
-        </w:rPr>
-        <w:t>thiết</w:t>
-      </w:r>
-      <w:proofErr w:type="spellEnd"/>
-      <w:r>
-        <w:rPr>
-          <w:rFonts w:ascii="Times New Roman" w:hAnsi="Times New Roman" w:cs="Times New Roman"/>
-          <w:sz w:val="24"/>
-          <w:szCs w:val="24"/>
-        </w:rPr>
-        <w:t xml:space="preserve"> </w:t>
-      </w:r>
-      <w:proofErr w:type="spellStart"/>
-      <w:proofErr w:type="gramStart"/>
-      <w:r>
-        <w:rPr>
-          <w:rFonts w:ascii="Times New Roman" w:hAnsi="Times New Roman" w:cs="Times New Roman"/>
-          <w:sz w:val="24"/>
-          <w:szCs w:val="24"/>
-        </w:rPr>
-        <w:t>bị</w:t>
-      </w:r>
-      <w:proofErr w:type="spellEnd"/>
-      <w:r>
-        <w:rPr>
-          <w:rFonts w:ascii="Times New Roman" w:hAnsi="Times New Roman" w:cs="Times New Roman"/>
-          <w:sz w:val="24"/>
-          <w:szCs w:val="24"/>
-        </w:rPr>
-        <w:t>:…</w:t>
-      </w:r>
-      <w:proofErr w:type="gramEnd"/>
-      <w:r>
-        <w:rPr>
-          <w:rFonts w:ascii="Times New Roman" w:hAnsi="Times New Roman" w:cs="Times New Roman"/>
-          <w:sz w:val="24"/>
-          <w:szCs w:val="24"/>
-        </w:rPr>
-        <w:t>……………………………………………………………………………………………………………………….</w:t>
+        <w:jc w:val="both"/>
+        <w:rPr>
+          <w:rFonts w:ascii="Times New Roman" w:hAnsi="Times New Roman" w:cs="Times New Roman"/>
+          <w:sz w:val="24"/>
+          <w:szCs w:val="24"/>
+        </w:rPr>
+      </w:pPr>
+      <w:r>
+        <w:rPr>
+          <w:rFonts w:ascii="Times New Roman" w:hAnsi="Times New Roman" w:cs="Times New Roman"/>
+          <w:sz w:val="24"/>
+          <w:szCs w:val="24"/>
+        </w:rPr>
+        <w:t>Tình trạng thiết bị:………………………………………………………………………………………………………………………….</w:t>
       </w:r>
     </w:p>
     <w:p>
@@ -1420,118 +996,20 @@
           <w:numId w:val="3"/>
         </w:numPr>
         <w:ind w:left="1134" w:firstLine="0"/>
-        <w:rPr>
-          <w:rFonts w:ascii="Times New Roman" w:hAnsi="Times New Roman" w:cs="Times New Roman"/>
-          <w:sz w:val="24"/>
-          <w:szCs w:val="24"/>
-        </w:rPr>
-      </w:pPr>
-      <w:r>
-        <w:rPr>
-          <w:rFonts w:ascii="Times New Roman" w:hAnsi="Times New Roman" w:cs="Times New Roman"/>
-          <w:sz w:val="24"/>
-          <w:szCs w:val="24"/>
-        </w:rPr>
-        <w:t xml:space="preserve"> </w:t>
-      </w:r>
-      <w:proofErr w:type="spellStart"/>
-      <w:r>
-        <w:rPr>
-          <w:rFonts w:ascii="Times New Roman" w:hAnsi="Times New Roman" w:cs="Times New Roman"/>
-          <w:sz w:val="24"/>
-          <w:szCs w:val="24"/>
-        </w:rPr>
-        <w:t>Xác</w:t>
-      </w:r>
-      <w:proofErr w:type="spellEnd"/>
-      <w:r>
-        <w:rPr>
-          <w:rFonts w:ascii="Times New Roman" w:hAnsi="Times New Roman" w:cs="Times New Roman"/>
-          <w:sz w:val="24"/>
-          <w:szCs w:val="24"/>
-        </w:rPr>
-        <w:t xml:space="preserve"> </w:t>
-      </w:r>
-      <w:proofErr w:type="spellStart"/>
-      <w:r>
-        <w:rPr>
-          <w:rFonts w:ascii="Times New Roman" w:hAnsi="Times New Roman" w:cs="Times New Roman"/>
-          <w:sz w:val="24"/>
-          <w:szCs w:val="24"/>
-        </w:rPr>
-        <w:t>nhận</w:t>
-      </w:r>
-      <w:proofErr w:type="spellEnd"/>
-      <w:r>
-        <w:rPr>
-          <w:rFonts w:ascii="Times New Roman" w:hAnsi="Times New Roman" w:cs="Times New Roman"/>
-          <w:sz w:val="24"/>
-          <w:szCs w:val="24"/>
-        </w:rPr>
-        <w:t xml:space="preserve"> </w:t>
-      </w:r>
-      <w:proofErr w:type="spellStart"/>
-      <w:r>
-        <w:rPr>
-          <w:rFonts w:ascii="Times New Roman" w:hAnsi="Times New Roman" w:cs="Times New Roman"/>
-          <w:sz w:val="24"/>
-          <w:szCs w:val="24"/>
-        </w:rPr>
-        <w:t>hiện</w:t>
-      </w:r>
-      <w:proofErr w:type="spellEnd"/>
-      <w:r>
-        <w:rPr>
-          <w:rFonts w:ascii="Times New Roman" w:hAnsi="Times New Roman" w:cs="Times New Roman"/>
-          <w:sz w:val="24"/>
-          <w:szCs w:val="24"/>
-        </w:rPr>
-        <w:t xml:space="preserve"> </w:t>
-      </w:r>
-      <w:proofErr w:type="spellStart"/>
-      <w:r>
-        <w:rPr>
-          <w:rFonts w:ascii="Times New Roman" w:hAnsi="Times New Roman" w:cs="Times New Roman"/>
-          <w:sz w:val="24"/>
-          <w:szCs w:val="24"/>
-        </w:rPr>
-        <w:t>trạng</w:t>
-      </w:r>
-      <w:proofErr w:type="spellEnd"/>
-      <w:r>
-        <w:rPr>
-          <w:rFonts w:ascii="Times New Roman" w:hAnsi="Times New Roman" w:cs="Times New Roman"/>
-          <w:sz w:val="24"/>
-          <w:szCs w:val="24"/>
-        </w:rPr>
-        <w:t xml:space="preserve"> </w:t>
-      </w:r>
-      <w:proofErr w:type="spellStart"/>
-      <w:r>
-        <w:rPr>
-          <w:rFonts w:ascii="Times New Roman" w:hAnsi="Times New Roman" w:cs="Times New Roman"/>
-          <w:sz w:val="24"/>
-          <w:szCs w:val="24"/>
-        </w:rPr>
-        <w:t>xung</w:t>
-      </w:r>
-      <w:proofErr w:type="spellEnd"/>
-      <w:r>
-        <w:rPr>
-          <w:rFonts w:ascii="Times New Roman" w:hAnsi="Times New Roman" w:cs="Times New Roman"/>
-          <w:sz w:val="24"/>
-          <w:szCs w:val="24"/>
-        </w:rPr>
-        <w:t xml:space="preserve"> </w:t>
-      </w:r>
-      <w:proofErr w:type="spellStart"/>
-      <w:r>
-        <w:rPr>
-          <w:rFonts w:ascii="Times New Roman" w:hAnsi="Times New Roman" w:cs="Times New Roman"/>
-          <w:sz w:val="24"/>
-          <w:szCs w:val="24"/>
-        </w:rPr>
-        <w:t>quan</w:t>
+        <w:jc w:val="both"/>
+        <w:rPr>
+          <w:rFonts w:ascii="Times New Roman" w:hAnsi="Times New Roman" w:cs="Times New Roman"/>
+          <w:sz w:val="24"/>
+          <w:szCs w:val="24"/>
+        </w:rPr>
+      </w:pPr>
+      <w:r>
+        <w:rPr>
+          <w:rFonts w:ascii="Times New Roman" w:hAnsi="Times New Roman" w:cs="Times New Roman"/>
+          <w:sz w:val="24"/>
+          <w:szCs w:val="24"/>
+        </w:rPr>
+        <w:t>Xác nhận hiện trạng xung quan</w:t>
       </w:r>
       <w:r>
         <w:rPr>
@@ -1541,97 +1019,14 @@
         </w:rPr>
         <w:t>h</w:t>
       </w:r>
-      <w:proofErr w:type="spellEnd"/>
-      <w:r>
-        <w:rPr>
-          <w:rFonts w:ascii="Times New Roman" w:hAnsi="Times New Roman" w:cs="Times New Roman"/>
-          <w:sz w:val="24"/>
-          <w:szCs w:val="24"/>
-        </w:rPr>
-        <w:t xml:space="preserve"> </w:t>
-      </w:r>
-      <w:proofErr w:type="spellStart"/>
-      <w:r>
-        <w:rPr>
-          <w:rFonts w:ascii="Times New Roman" w:hAnsi="Times New Roman" w:cs="Times New Roman"/>
-          <w:sz w:val="24"/>
-          <w:szCs w:val="24"/>
-        </w:rPr>
-        <w:t>vị</w:t>
-      </w:r>
-      <w:proofErr w:type="spellEnd"/>
-      <w:r>
-        <w:rPr>
-          <w:rFonts w:ascii="Times New Roman" w:hAnsi="Times New Roman" w:cs="Times New Roman"/>
-          <w:sz w:val="24"/>
-          <w:szCs w:val="24"/>
-        </w:rPr>
-        <w:t xml:space="preserve"> </w:t>
-      </w:r>
-      <w:proofErr w:type="spellStart"/>
-      <w:r>
-        <w:rPr>
-          <w:rFonts w:ascii="Times New Roman" w:hAnsi="Times New Roman" w:cs="Times New Roman"/>
-          <w:sz w:val="24"/>
-          <w:szCs w:val="24"/>
-        </w:rPr>
-        <w:t>trí</w:t>
-      </w:r>
-      <w:proofErr w:type="spellEnd"/>
-      <w:r>
-        <w:rPr>
-          <w:rFonts w:ascii="Times New Roman" w:hAnsi="Times New Roman" w:cs="Times New Roman"/>
-          <w:sz w:val="24"/>
-          <w:szCs w:val="24"/>
-        </w:rPr>
-        <w:t xml:space="preserve"> </w:t>
-      </w:r>
-      <w:proofErr w:type="spellStart"/>
-      <w:r>
-        <w:rPr>
-          <w:rFonts w:ascii="Times New Roman" w:hAnsi="Times New Roman" w:cs="Times New Roman"/>
-          <w:sz w:val="24"/>
-          <w:szCs w:val="24"/>
-        </w:rPr>
-        <w:t>lắp</w:t>
-      </w:r>
-      <w:proofErr w:type="spellEnd"/>
-      <w:r>
-        <w:rPr>
-          <w:rFonts w:ascii="Times New Roman" w:hAnsi="Times New Roman" w:cs="Times New Roman"/>
-          <w:sz w:val="24"/>
-          <w:szCs w:val="24"/>
-        </w:rPr>
-        <w:t xml:space="preserve">: </w:t>
-      </w:r>
-      <w:proofErr w:type="spellStart"/>
-      <w:r>
-        <w:rPr>
-          <w:rFonts w:ascii="Times New Roman" w:hAnsi="Times New Roman" w:cs="Times New Roman"/>
-          <w:sz w:val="24"/>
-          <w:szCs w:val="24"/>
-        </w:rPr>
-        <w:t>Bình</w:t>
-      </w:r>
-      <w:proofErr w:type="spellEnd"/>
-      <w:r>
-        <w:rPr>
-          <w:rFonts w:ascii="Times New Roman" w:hAnsi="Times New Roman" w:cs="Times New Roman"/>
-          <w:sz w:val="24"/>
-          <w:szCs w:val="24"/>
-        </w:rPr>
-        <w:t xml:space="preserve"> </w:t>
-      </w:r>
-      <w:proofErr w:type="spellStart"/>
-      <w:r>
-        <w:rPr>
-          <w:rFonts w:ascii="Times New Roman" w:hAnsi="Times New Roman" w:cs="Times New Roman"/>
-          <w:sz w:val="24"/>
-          <w:szCs w:val="24"/>
-        </w:rPr>
-        <w:t>thường</w:t>
-      </w:r>
-      <w:proofErr w:type="spellEnd"/>
+      <w:r>
+        <w:rPr>
+          <w:rFonts w:ascii="Times New Roman" w:hAnsi="Times New Roman" w:cs="Times New Roman"/>
+          <w:sz w:val="24"/>
+          <w:szCs w:val="24"/>
+        </w:rPr>
+        <w:t xml:space="preserve"> vị trí lắp: Bình thường</w:t>
+      </w:r>
     </w:p>
     <w:p>
       <w:pPr>
@@ -1641,210 +1036,21 @@
           <w:numId w:val="3"/>
         </w:numPr>
         <w:ind w:left="1134" w:firstLine="0"/>
-        <w:rPr>
-          <w:rFonts w:ascii="Times New Roman" w:hAnsi="Times New Roman" w:cs="Times New Roman"/>
-          <w:sz w:val="24"/>
-          <w:szCs w:val="24"/>
-        </w:rPr>
-      </w:pPr>
-      <w:r>
-        <w:rPr>
-          <w:rFonts w:ascii="Times New Roman" w:hAnsi="Times New Roman" w:cs="Times New Roman"/>
-          <w:sz w:val="24"/>
-          <w:szCs w:val="24"/>
-        </w:rPr>
-        <w:t xml:space="preserve"> </w:t>
-      </w:r>
-      <w:proofErr w:type="spellStart"/>
-      <w:r>
-        <w:rPr>
-          <w:rFonts w:ascii="Times New Roman" w:hAnsi="Times New Roman" w:cs="Times New Roman"/>
-          <w:sz w:val="24"/>
-          <w:szCs w:val="24"/>
-        </w:rPr>
-        <w:t>Xác</w:t>
-      </w:r>
-      <w:proofErr w:type="spellEnd"/>
-      <w:r>
-        <w:rPr>
-          <w:rFonts w:ascii="Times New Roman" w:hAnsi="Times New Roman" w:cs="Times New Roman"/>
-          <w:sz w:val="24"/>
-          <w:szCs w:val="24"/>
-        </w:rPr>
-        <w:t xml:space="preserve"> </w:t>
-      </w:r>
-      <w:proofErr w:type="spellStart"/>
-      <w:r>
-        <w:rPr>
-          <w:rFonts w:ascii="Times New Roman" w:hAnsi="Times New Roman" w:cs="Times New Roman"/>
-          <w:sz w:val="24"/>
-          <w:szCs w:val="24"/>
-        </w:rPr>
-        <w:t>nhận</w:t>
-      </w:r>
-      <w:proofErr w:type="spellEnd"/>
-      <w:r>
-        <w:rPr>
-          <w:rFonts w:ascii="Times New Roman" w:hAnsi="Times New Roman" w:cs="Times New Roman"/>
-          <w:sz w:val="24"/>
-          <w:szCs w:val="24"/>
-        </w:rPr>
-        <w:t xml:space="preserve"> </w:t>
-      </w:r>
-      <w:proofErr w:type="spellStart"/>
-      <w:r>
-        <w:rPr>
-          <w:rFonts w:ascii="Times New Roman" w:hAnsi="Times New Roman" w:cs="Times New Roman"/>
-          <w:sz w:val="24"/>
-          <w:szCs w:val="24"/>
-        </w:rPr>
-        <w:t>đạt</w:t>
-      </w:r>
-      <w:proofErr w:type="spellEnd"/>
-      <w:r>
-        <w:rPr>
-          <w:rFonts w:ascii="Times New Roman" w:hAnsi="Times New Roman" w:cs="Times New Roman"/>
-          <w:sz w:val="24"/>
-          <w:szCs w:val="24"/>
-        </w:rPr>
-        <w:t xml:space="preserve"> </w:t>
-      </w:r>
-      <w:proofErr w:type="spellStart"/>
-      <w:r>
-        <w:rPr>
-          <w:rFonts w:ascii="Times New Roman" w:hAnsi="Times New Roman" w:cs="Times New Roman"/>
-          <w:sz w:val="24"/>
-          <w:szCs w:val="24"/>
-        </w:rPr>
-        <w:t>tiêu</w:t>
-      </w:r>
-      <w:proofErr w:type="spellEnd"/>
-      <w:r>
-        <w:rPr>
-          <w:rFonts w:ascii="Times New Roman" w:hAnsi="Times New Roman" w:cs="Times New Roman"/>
-          <w:sz w:val="24"/>
-          <w:szCs w:val="24"/>
-        </w:rPr>
-        <w:t xml:space="preserve"> </w:t>
-      </w:r>
-      <w:proofErr w:type="spellStart"/>
-      <w:r>
-        <w:rPr>
-          <w:rFonts w:ascii="Times New Roman" w:hAnsi="Times New Roman" w:cs="Times New Roman"/>
-          <w:sz w:val="24"/>
-          <w:szCs w:val="24"/>
-        </w:rPr>
-        <w:t>chuẩn</w:t>
-      </w:r>
-      <w:proofErr w:type="spellEnd"/>
-      <w:r>
-        <w:rPr>
-          <w:rFonts w:ascii="Times New Roman" w:hAnsi="Times New Roman" w:cs="Times New Roman"/>
-          <w:sz w:val="24"/>
-          <w:szCs w:val="24"/>
-        </w:rPr>
-        <w:t xml:space="preserve"> </w:t>
-      </w:r>
-      <w:proofErr w:type="spellStart"/>
-      <w:r>
-        <w:rPr>
-          <w:rFonts w:ascii="Times New Roman" w:hAnsi="Times New Roman" w:cs="Times New Roman"/>
-          <w:sz w:val="24"/>
-          <w:szCs w:val="24"/>
-        </w:rPr>
-        <w:t>kỹ</w:t>
-      </w:r>
-      <w:proofErr w:type="spellEnd"/>
-      <w:r>
-        <w:rPr>
-          <w:rFonts w:ascii="Times New Roman" w:hAnsi="Times New Roman" w:cs="Times New Roman"/>
-          <w:sz w:val="24"/>
-          <w:szCs w:val="24"/>
-        </w:rPr>
-        <w:t xml:space="preserve"> </w:t>
-      </w:r>
-      <w:proofErr w:type="spellStart"/>
-      <w:r>
-        <w:rPr>
-          <w:rFonts w:ascii="Times New Roman" w:hAnsi="Times New Roman" w:cs="Times New Roman"/>
-          <w:sz w:val="24"/>
-          <w:szCs w:val="24"/>
-        </w:rPr>
-        <w:t>thuật</w:t>
-      </w:r>
-      <w:proofErr w:type="spellEnd"/>
-      <w:r>
-        <w:rPr>
-          <w:rFonts w:ascii="Times New Roman" w:hAnsi="Times New Roman" w:cs="Times New Roman"/>
-          <w:sz w:val="24"/>
-          <w:szCs w:val="24"/>
-        </w:rPr>
-        <w:t xml:space="preserve">, an </w:t>
-      </w:r>
-      <w:proofErr w:type="spellStart"/>
-      <w:r>
-        <w:rPr>
-          <w:rFonts w:ascii="Times New Roman" w:hAnsi="Times New Roman" w:cs="Times New Roman"/>
-          <w:sz w:val="24"/>
-          <w:szCs w:val="24"/>
-        </w:rPr>
-        <w:t>toàn</w:t>
-      </w:r>
-      <w:proofErr w:type="spellEnd"/>
-      <w:r>
-        <w:rPr>
-          <w:rFonts w:ascii="Times New Roman" w:hAnsi="Times New Roman" w:cs="Times New Roman"/>
-          <w:sz w:val="24"/>
-          <w:szCs w:val="24"/>
-        </w:rPr>
-        <w:t xml:space="preserve"> </w:t>
-      </w:r>
-      <w:proofErr w:type="spellStart"/>
-      <w:r>
-        <w:rPr>
-          <w:rFonts w:ascii="Times New Roman" w:hAnsi="Times New Roman" w:cs="Times New Roman"/>
-          <w:sz w:val="24"/>
-          <w:szCs w:val="24"/>
-        </w:rPr>
-        <w:t>điện</w:t>
-      </w:r>
-      <w:proofErr w:type="spellEnd"/>
-      <w:r>
-        <w:rPr>
-          <w:rFonts w:ascii="Times New Roman" w:hAnsi="Times New Roman" w:cs="Times New Roman"/>
-          <w:sz w:val="24"/>
-          <w:szCs w:val="24"/>
-        </w:rPr>
-        <w:t xml:space="preserve">: </w:t>
-      </w:r>
-      <w:proofErr w:type="spellStart"/>
-      <w:r>
-        <w:rPr>
-          <w:rFonts w:ascii="Times New Roman" w:hAnsi="Times New Roman" w:cs="Times New Roman"/>
-          <w:sz w:val="24"/>
-          <w:szCs w:val="24"/>
-        </w:rPr>
-        <w:t>Đảm</w:t>
-      </w:r>
-      <w:proofErr w:type="spellEnd"/>
-      <w:r>
-        <w:rPr>
-          <w:rFonts w:ascii="Times New Roman" w:hAnsi="Times New Roman" w:cs="Times New Roman"/>
-          <w:sz w:val="24"/>
-          <w:szCs w:val="24"/>
-        </w:rPr>
-        <w:t xml:space="preserve"> </w:t>
-      </w:r>
-      <w:proofErr w:type="spellStart"/>
-      <w:r>
-        <w:rPr>
-          <w:rFonts w:ascii="Times New Roman" w:hAnsi="Times New Roman" w:cs="Times New Roman"/>
-          <w:sz w:val="24"/>
-          <w:szCs w:val="24"/>
-        </w:rPr>
-        <w:t>bảo</w:t>
-      </w:r>
-      <w:proofErr w:type="spellEnd"/>
+        <w:jc w:val="both"/>
+        <w:rPr>
+          <w:rFonts w:ascii="Times New Roman" w:hAnsi="Times New Roman" w:cs="Times New Roman"/>
+          <w:sz w:val="24"/>
+          <w:szCs w:val="24"/>
+        </w:rPr>
+      </w:pPr>
+      <w:r>
+        <w:rPr>
+          <w:rFonts w:ascii="Times New Roman" w:hAnsi="Times New Roman" w:cs="Times New Roman"/>
+          <w:sz w:val="24"/>
+          <w:szCs w:val="24"/>
+        </w:rPr>
+        <w:t>Xác nhận đạt tiêu chuẩn kỹ thuật, an toàn điện: Đảm bảo</w:t>
+      </w:r>
     </w:p>
     <w:p>
       <w:pPr>
@@ -1854,111 +1060,20 @@
           <w:numId w:val="3"/>
         </w:numPr>
         <w:ind w:left="1134" w:firstLine="0"/>
-        <w:rPr>
-          <w:rFonts w:ascii="Times New Roman" w:hAnsi="Times New Roman" w:cs="Times New Roman"/>
-          <w:sz w:val="24"/>
-          <w:szCs w:val="24"/>
-        </w:rPr>
-      </w:pPr>
-      <w:r>
-        <w:rPr>
-          <w:rFonts w:ascii="Times New Roman" w:hAnsi="Times New Roman" w:cs="Times New Roman"/>
-          <w:sz w:val="24"/>
-          <w:szCs w:val="24"/>
-        </w:rPr>
-        <w:t xml:space="preserve"> </w:t>
-      </w:r>
-      <w:bookmarkStart w:id="0" w:name="_GoBack"/>
-      <w:bookmarkEnd w:id="0"/>
-      <w:proofErr w:type="spellStart"/>
-      <w:r>
-        <w:rPr>
-          <w:rFonts w:ascii="Times New Roman" w:hAnsi="Times New Roman" w:cs="Times New Roman"/>
-          <w:sz w:val="24"/>
-          <w:szCs w:val="24"/>
-        </w:rPr>
-        <w:t>Thông</w:t>
-      </w:r>
-      <w:proofErr w:type="spellEnd"/>
-      <w:r>
-        <w:rPr>
-          <w:rFonts w:ascii="Times New Roman" w:hAnsi="Times New Roman" w:cs="Times New Roman"/>
-          <w:sz w:val="24"/>
-          <w:szCs w:val="24"/>
-        </w:rPr>
-        <w:t xml:space="preserve"> tin </w:t>
-      </w:r>
-      <w:proofErr w:type="spellStart"/>
-      <w:r>
-        <w:rPr>
-          <w:rFonts w:ascii="Times New Roman" w:hAnsi="Times New Roman" w:cs="Times New Roman"/>
-          <w:sz w:val="24"/>
-          <w:szCs w:val="24"/>
-        </w:rPr>
-        <w:t>liên</w:t>
-      </w:r>
-      <w:proofErr w:type="spellEnd"/>
-      <w:r>
-        <w:rPr>
-          <w:rFonts w:ascii="Times New Roman" w:hAnsi="Times New Roman" w:cs="Times New Roman"/>
-          <w:sz w:val="24"/>
-          <w:szCs w:val="24"/>
-        </w:rPr>
-        <w:t xml:space="preserve"> </w:t>
-      </w:r>
-      <w:proofErr w:type="spellStart"/>
-      <w:r>
-        <w:rPr>
-          <w:rFonts w:ascii="Times New Roman" w:hAnsi="Times New Roman" w:cs="Times New Roman"/>
-          <w:sz w:val="24"/>
-          <w:szCs w:val="24"/>
-        </w:rPr>
-        <w:t>hệ</w:t>
-      </w:r>
-      <w:proofErr w:type="spellEnd"/>
-      <w:r>
-        <w:rPr>
-          <w:rFonts w:ascii="Times New Roman" w:hAnsi="Times New Roman" w:cs="Times New Roman"/>
-          <w:sz w:val="24"/>
-          <w:szCs w:val="24"/>
-        </w:rPr>
-        <w:t xml:space="preserve"> </w:t>
-      </w:r>
-      <w:proofErr w:type="spellStart"/>
-      <w:r>
-        <w:rPr>
-          <w:rFonts w:ascii="Times New Roman" w:hAnsi="Times New Roman" w:cs="Times New Roman"/>
-          <w:sz w:val="24"/>
-          <w:szCs w:val="24"/>
-        </w:rPr>
-        <w:t>bên</w:t>
-      </w:r>
-      <w:proofErr w:type="spellEnd"/>
-      <w:r>
-        <w:rPr>
-          <w:rFonts w:ascii="Times New Roman" w:hAnsi="Times New Roman" w:cs="Times New Roman"/>
-          <w:sz w:val="24"/>
-          <w:szCs w:val="24"/>
-        </w:rPr>
-        <w:t xml:space="preserve"> </w:t>
-      </w:r>
-      <w:proofErr w:type="spellStart"/>
-      <w:r>
-        <w:rPr>
-          <w:rFonts w:ascii="Times New Roman" w:hAnsi="Times New Roman" w:cs="Times New Roman"/>
-          <w:sz w:val="24"/>
-          <w:szCs w:val="24"/>
-        </w:rPr>
-        <w:t>nhận</w:t>
-      </w:r>
-      <w:proofErr w:type="spellEnd"/>
-      <w:r>
-        <w:rPr>
-          <w:rFonts w:ascii="Times New Roman" w:hAnsi="Times New Roman" w:cs="Times New Roman"/>
-          <w:sz w:val="24"/>
-          <w:szCs w:val="24"/>
-        </w:rPr>
-        <w:t>:…………………………………………………………………………………………………………………</w:t>
+        <w:jc w:val="both"/>
+        <w:rPr>
+          <w:rFonts w:ascii="Times New Roman" w:hAnsi="Times New Roman" w:cs="Times New Roman"/>
+          <w:sz w:val="24"/>
+          <w:szCs w:val="24"/>
+        </w:rPr>
+      </w:pPr>
+      <w:r>
+        <w:rPr>
+          <w:rFonts w:ascii="Times New Roman" w:hAnsi="Times New Roman" w:cs="Times New Roman"/>
+          <w:sz w:val="24"/>
+          <w:szCs w:val="24"/>
+        </w:rPr>
+        <w:t>Thông tin liên hệ bên nhận:…………………………………………………………………………………………………………………</w:t>
       </w:r>
     </w:p>
     <w:p>
@@ -1988,72 +1103,8 @@
           <w:sz w:val="24"/>
           <w:szCs w:val="24"/>
         </w:rPr>
-        <w:t xml:space="preserve"> </w:t>
-      </w:r>
-      <w:proofErr w:type="spellStart"/>
-      <w:r>
-        <w:rPr>
-          <w:rFonts w:ascii="Times New Roman" w:hAnsi="Times New Roman" w:cs="Times New Roman"/>
-          <w:sz w:val="24"/>
-          <w:szCs w:val="24"/>
-        </w:rPr>
-        <w:t>với</w:t>
-      </w:r>
-      <w:proofErr w:type="spellEnd"/>
-      <w:r>
-        <w:rPr>
-          <w:rFonts w:ascii="Times New Roman" w:hAnsi="Times New Roman" w:cs="Times New Roman"/>
-          <w:sz w:val="24"/>
-          <w:szCs w:val="24"/>
-        </w:rPr>
-        <w:t xml:space="preserve"> </w:t>
-      </w:r>
-      <w:proofErr w:type="spellStart"/>
-      <w:r>
-        <w:rPr>
-          <w:rFonts w:ascii="Times New Roman" w:hAnsi="Times New Roman" w:cs="Times New Roman"/>
-          <w:sz w:val="24"/>
-          <w:szCs w:val="24"/>
-        </w:rPr>
-        <w:t>các</w:t>
-      </w:r>
-      <w:proofErr w:type="spellEnd"/>
-      <w:r>
-        <w:rPr>
-          <w:rFonts w:ascii="Times New Roman" w:hAnsi="Times New Roman" w:cs="Times New Roman"/>
-          <w:sz w:val="24"/>
-          <w:szCs w:val="24"/>
-        </w:rPr>
-        <w:t xml:space="preserve"> </w:t>
-      </w:r>
-      <w:proofErr w:type="spellStart"/>
-      <w:r>
-        <w:rPr>
-          <w:rFonts w:ascii="Times New Roman" w:hAnsi="Times New Roman" w:cs="Times New Roman"/>
-          <w:sz w:val="24"/>
-          <w:szCs w:val="24"/>
-        </w:rPr>
-        <w:t>nội</w:t>
-      </w:r>
-      <w:proofErr w:type="spellEnd"/>
-      <w:r>
-        <w:rPr>
-          <w:rFonts w:ascii="Times New Roman" w:hAnsi="Times New Roman" w:cs="Times New Roman"/>
-          <w:sz w:val="24"/>
-          <w:szCs w:val="24"/>
-        </w:rPr>
-        <w:t xml:space="preserve"> dung </w:t>
-      </w:r>
-      <w:proofErr w:type="spellStart"/>
-      <w:r>
-        <w:rPr>
-          <w:rFonts w:ascii="Times New Roman" w:hAnsi="Times New Roman" w:cs="Times New Roman"/>
-          <w:sz w:val="24"/>
-          <w:szCs w:val="24"/>
-        </w:rPr>
-        <w:t>trên</w:t>
-      </w:r>
-      <w:proofErr w:type="spellEnd"/>
+        <w:t xml:space="preserve"> với các nội dung trên</w:t>
+      </w:r>
       <w:r>
         <w:rPr>
           <w:rFonts w:ascii="Times New Roman" w:hAnsi="Times New Roman" w:cs="Times New Roman"/>
@@ -2101,7 +1152,7 @@
 </file>
 
 <file path=word/endnotes.xml><?xml version="1.0" encoding="utf-8"?>
-<w:endnotes xmlns:wpc="http://schemas.microsoft.com/office/word/2010/wordprocessingCanvas" xmlns:cx="http://schemas.microsoft.com/office/drawing/2014/chartex" xmlns:mc="http://schemas.openxmlformats.org/markup-compatibility/2006" xmlns:o="urn:schemas-microsoft-com:office:office" xmlns:r="http://schemas.openxmlformats.org/officeDocument/2006/relationships" xmlns:m="http://schemas.openxmlformats.org/officeDocument/2006/math" xmlns:v="urn:schemas-microsoft-com:vml" xmlns:wp14="http://schemas.microsoft.com/office/word/2010/wordprocessingDrawing" xmlns:wp="http://schemas.openxmlformats.org/drawingml/2006/wordprocessingDrawing" xmlns:w10="urn:schemas-microsoft-com:office:word" xmlns:w="http://schemas.openxmlformats.org/wordprocessingml/2006/main" xmlns:w14="http://schemas.microsoft.com/office/word/2010/wordml" xmlns:w15="http://schemas.microsoft.com/office/word/2012/wordml" xmlns:w16se="http://schemas.microsoft.com/office/word/2015/wordml/symex" xmlns:wpg="http://schemas.microsoft.com/office/word/2010/wordprocessingGroup" xmlns:wpi="http://schemas.microsoft.com/office/word/2010/wordprocessingInk" xmlns:wne="http://schemas.microsoft.com/office/word/2006/wordml" xmlns:wps="http://schemas.microsoft.com/office/word/2010/wordprocessingShape" mc:Ignorable="w14 w15 w16se wp14">
+<w:endnotes xmlns:wpc="http://schemas.microsoft.com/office/word/2010/wordprocessingCanvas" xmlns:cx="http://schemas.microsoft.com/office/drawing/2014/chartex" xmlns:cx1="http://schemas.microsoft.com/office/drawing/2015/9/8/chartex" xmlns:cx2="http://schemas.microsoft.com/office/drawing/2015/10/21/chartex" xmlns:cx3="http://schemas.microsoft.com/office/drawing/2016/5/9/chartex" xmlns:cx4="http://schemas.microsoft.com/office/drawing/2016/5/10/chartex" xmlns:cx5="http://schemas.microsoft.com/office/drawing/2016/5/11/chartex" xmlns:cx6="http://schemas.microsoft.com/office/drawing/2016/5/12/chartex" xmlns:cx7="http://schemas.microsoft.com/office/drawing/2016/5/13/chartex" xmlns:cx8="http://schemas.microsoft.com/office/drawing/2016/5/14/chartex" xmlns:mc="http://schemas.openxmlformats.org/markup-compatibility/2006" xmlns:aink="http://schemas.microsoft.com/office/drawing/2016/ink" xmlns:am3d="http://schemas.microsoft.com/office/drawing/2017/model3d" xmlns:o="urn:schemas-microsoft-com:office:office" xmlns:oel="http://schemas.microsoft.com/office/2019/extlst" xmlns:r="http://schemas.openxmlformats.org/officeDocument/2006/relationships" xmlns:m="http://schemas.openxmlformats.org/officeDocument/2006/math" xmlns:v="urn:schemas-microsoft-com:vml" xmlns:wp14="http://schemas.microsoft.com/office/word/2010/wordprocessingDrawing" xmlns:wp="http://schemas.openxmlformats.org/drawingml/2006/wordprocessingDrawing" xmlns:w10="urn:schemas-microsoft-com:office:word" xmlns:w="http://schemas.openxmlformats.org/wordprocessingml/2006/main" xmlns:w14="http://schemas.microsoft.com/office/word/2010/wordml" xmlns:w15="http://schemas.microsoft.com/office/word/2012/wordml" xmlns:w16cex="http://schemas.microsoft.com/office/word/2018/wordml/cex" xmlns:w16cid="http://schemas.microsoft.com/office/word/2016/wordml/cid" xmlns:w16="http://schemas.microsoft.com/office/word/2018/wordml" xmlns:w16du="http://schemas.microsoft.com/office/word/2023/wordml/word16du" xmlns:w16sdtdh="http://schemas.microsoft.com/office/word/2020/wordml/sdtdatahash" xmlns:w16sdtfl="http://schemas.microsoft.com/office/word/2024/wordml/sdtformatlock" xmlns:w16se="http://schemas.microsoft.com/office/word/2015/wordml/symex" xmlns:wpg="http://schemas.microsoft.com/office/word/2010/wordprocessingGroup" xmlns:wpi="http://schemas.microsoft.com/office/word/2010/wordprocessingInk" xmlns:wne="http://schemas.microsoft.com/office/word/2006/wordml" xmlns:wps="http://schemas.microsoft.com/office/word/2010/wordprocessingShape" mc:Ignorable="w14 w15 w16se w16cid w16 w16cex w16sdtdh w16sdtfl w16du wp14">
   <w:endnote w:type="separator" w:id="-1">
     <w:p>
       <w:pPr>
@@ -2126,7 +1177,7 @@
 </file>
 
 <file path=word/footnotes.xml><?xml version="1.0" encoding="utf-8"?>
-<w:footnotes xmlns:wpc="http://schemas.microsoft.com/office/word/2010/wordprocessingCanvas" xmlns:cx="http://schemas.microsoft.com/office/drawing/2014/chartex" xmlns:mc="http://schemas.openxmlformats.org/markup-compatibility/2006" xmlns:o="urn:schemas-microsoft-com:office:office" xmlns:r="http://schemas.openxmlformats.org/officeDocument/2006/relationships" xmlns:m="http://schemas.openxmlformats.org/officeDocument/2006/math" xmlns:v="urn:schemas-microsoft-com:vml" xmlns:wp14="http://schemas.microsoft.com/office/word/2010/wordprocessingDrawing" xmlns:wp="http://schemas.openxmlformats.org/drawingml/2006/wordprocessingDrawing" xmlns:w10="urn:schemas-microsoft-com:office:word" xmlns:w="http://schemas.openxmlformats.org/wordprocessingml/2006/main" xmlns:w14="http://schemas.microsoft.com/office/word/2010/wordml" xmlns:w15="http://schemas.microsoft.com/office/word/2012/wordml" xmlns:w16se="http://schemas.microsoft.com/office/word/2015/wordml/symex" xmlns:wpg="http://schemas.microsoft.com/office/word/2010/wordprocessingGroup" xmlns:wpi="http://schemas.microsoft.com/office/word/2010/wordprocessingInk" xmlns:wne="http://schemas.microsoft.com/office/word/2006/wordml" xmlns:wps="http://schemas.microsoft.com/office/word/2010/wordprocessingShape" mc:Ignorable="w14 w15 w16se wp14">
+<w:footnotes xmlns:wpc="http://schemas.microsoft.com/office/word/2010/wordprocessingCanvas" xmlns:cx="http://schemas.microsoft.com/office/drawing/2014/chartex" xmlns:cx1="http://schemas.microsoft.com/office/drawing/2015/9/8/chartex" xmlns:cx2="http://schemas.microsoft.com/office/drawing/2015/10/21/chartex" xmlns:cx3="http://schemas.microsoft.com/office/drawing/2016/5/9/chartex" xmlns:cx4="http://schemas.microsoft.com/office/drawing/2016/5/10/chartex" xmlns:cx5="http://schemas.microsoft.com/office/drawing/2016/5/11/chartex" xmlns:cx6="http://schemas.microsoft.com/office/drawing/2016/5/12/chartex" xmlns:cx7="http://schemas.microsoft.com/office/drawing/2016/5/13/chartex" xmlns:cx8="http://schemas.microsoft.com/office/drawing/2016/5/14/chartex" xmlns:mc="http://schemas.openxmlformats.org/markup-compatibility/2006" xmlns:aink="http://schemas.microsoft.com/office/drawing/2016/ink" xmlns:am3d="http://schemas.microsoft.com/office/drawing/2017/model3d" xmlns:o="urn:schemas-microsoft-com:office:office" xmlns:oel="http://schemas.microsoft.com/office/2019/extlst" xmlns:r="http://schemas.openxmlformats.org/officeDocument/2006/relationships" xmlns:m="http://schemas.openxmlformats.org/officeDocument/2006/math" xmlns:v="urn:schemas-microsoft-com:vml" xmlns:wp14="http://schemas.microsoft.com/office/word/2010/wordprocessingDrawing" xmlns:wp="http://schemas.openxmlformats.org/drawingml/2006/wordprocessingDrawing" xmlns:w10="urn:schemas-microsoft-com:office:word" xmlns:w="http://schemas.openxmlformats.org/wordprocessingml/2006/main" xmlns:w14="http://schemas.microsoft.com/office/word/2010/wordml" xmlns:w15="http://schemas.microsoft.com/office/word/2012/wordml" xmlns:w16cex="http://schemas.microsoft.com/office/word/2018/wordml/cex" xmlns:w16cid="http://schemas.microsoft.com/office/word/2016/wordml/cid" xmlns:w16="http://schemas.microsoft.com/office/word/2018/wordml" xmlns:w16du="http://schemas.microsoft.com/office/word/2023/wordml/word16du" xmlns:w16sdtdh="http://schemas.microsoft.com/office/word/2020/wordml/sdtdatahash" xmlns:w16sdtfl="http://schemas.microsoft.com/office/word/2024/wordml/sdtformatlock" xmlns:w16se="http://schemas.microsoft.com/office/word/2015/wordml/symex" xmlns:wpg="http://schemas.microsoft.com/office/word/2010/wordprocessingGroup" xmlns:wpi="http://schemas.microsoft.com/office/word/2010/wordprocessingInk" xmlns:wne="http://schemas.microsoft.com/office/word/2006/wordml" xmlns:wps="http://schemas.microsoft.com/office/word/2010/wordprocessingShape" mc:Ignorable="w14 w15 w16se w16cid w16 w16cex w16sdtdh w16sdtfl w16du wp14">
   <w:footnote w:type="separator" w:id="-1">
     <w:p>
       <w:pPr>
@@ -2151,7 +1202,7 @@
 </file>
 
 <file path=word/header1.xml><?xml version="1.0" encoding="utf-8"?>
-<w:hdr xmlns:wpc="http://schemas.microsoft.com/office/word/2010/wordprocessingCanvas" xmlns:cx="http://schemas.microsoft.com/office/drawing/2014/chartex" xmlns:mc="http://schemas.openxmlformats.org/markup-compatibility/2006" xmlns:o="urn:schemas-microsoft-com:office:office" xmlns:r="http://schemas.openxmlformats.org/officeDocument/2006/relationships" xmlns:m="http://schemas.openxmlformats.org/officeDocument/2006/math" xmlns:v="urn:schemas-microsoft-com:vml" xmlns:wp14="http://schemas.microsoft.com/office/word/2010/wordprocessingDrawing" xmlns:wp="http://schemas.openxmlformats.org/drawingml/2006/wordprocessingDrawing" xmlns:w10="urn:schemas-microsoft-com:office:word" xmlns:w="http://schemas.openxmlformats.org/wordprocessingml/2006/main" xmlns:w14="http://schemas.microsoft.com/office/word/2010/wordml" xmlns:w15="http://schemas.microsoft.com/office/word/2012/wordml" xmlns:w16se="http://schemas.microsoft.com/office/word/2015/wordml/symex" xmlns:wpg="http://schemas.microsoft.com/office/word/2010/wordprocessingGroup" xmlns:wpi="http://schemas.microsoft.com/office/word/2010/wordprocessingInk" xmlns:wne="http://schemas.microsoft.com/office/word/2006/wordml" xmlns:wps="http://schemas.microsoft.com/office/word/2010/wordprocessingShape" mc:Ignorable="w14 w15 w16se wp14">
+<w:hdr xmlns:wpc="http://schemas.microsoft.com/office/word/2010/wordprocessingCanvas" xmlns:cx="http://schemas.microsoft.com/office/drawing/2014/chartex" xmlns:cx1="http://schemas.microsoft.com/office/drawing/2015/9/8/chartex" xmlns:cx2="http://schemas.microsoft.com/office/drawing/2015/10/21/chartex" xmlns:cx3="http://schemas.microsoft.com/office/drawing/2016/5/9/chartex" xmlns:cx4="http://schemas.microsoft.com/office/drawing/2016/5/10/chartex" xmlns:cx5="http://schemas.microsoft.com/office/drawing/2016/5/11/chartex" xmlns:cx6="http://schemas.microsoft.com/office/drawing/2016/5/12/chartex" xmlns:cx7="http://schemas.microsoft.com/office/drawing/2016/5/13/chartex" xmlns:cx8="http://schemas.microsoft.com/office/drawing/2016/5/14/chartex" xmlns:mc="http://schemas.openxmlformats.org/markup-compatibility/2006" xmlns:aink="http://schemas.microsoft.com/office/drawing/2016/ink" xmlns:am3d="http://schemas.microsoft.com/office/drawing/2017/model3d" xmlns:o="urn:schemas-microsoft-com:office:office" xmlns:oel="http://schemas.microsoft.com/office/2019/extlst" xmlns:r="http://schemas.openxmlformats.org/officeDocument/2006/relationships" xmlns:m="http://schemas.openxmlformats.org/officeDocument/2006/math" xmlns:v="urn:schemas-microsoft-com:vml" xmlns:wp14="http://schemas.microsoft.com/office/word/2010/wordprocessingDrawing" xmlns:wp="http://schemas.openxmlformats.org/drawingml/2006/wordprocessingDrawing" xmlns:w10="urn:schemas-microsoft-com:office:word" xmlns:w="http://schemas.openxmlformats.org/wordprocessingml/2006/main" xmlns:w14="http://schemas.microsoft.com/office/word/2010/wordml" xmlns:w15="http://schemas.microsoft.com/office/word/2012/wordml" xmlns:w16cex="http://schemas.microsoft.com/office/word/2018/wordml/cex" xmlns:w16cid="http://schemas.microsoft.com/office/word/2016/wordml/cid" xmlns:w16="http://schemas.microsoft.com/office/word/2018/wordml" xmlns:w16du="http://schemas.microsoft.com/office/word/2023/wordml/word16du" xmlns:w16sdtdh="http://schemas.microsoft.com/office/word/2020/wordml/sdtdatahash" xmlns:w16sdtfl="http://schemas.microsoft.com/office/word/2024/wordml/sdtformatlock" xmlns:w16se="http://schemas.microsoft.com/office/word/2015/wordml/symex" xmlns:wpg="http://schemas.microsoft.com/office/word/2010/wordprocessingGroup" xmlns:wpi="http://schemas.microsoft.com/office/word/2010/wordprocessingInk" xmlns:wne="http://schemas.microsoft.com/office/word/2006/wordml" xmlns:wps="http://schemas.microsoft.com/office/word/2010/wordprocessingShape" mc:Ignorable="w14 w15 w16se w16cid w16 w16cex w16sdtdh w16sdtfl w16du wp14">
   <w:p>
     <w:pPr>
       <w:pStyle w:val="Header"/>
@@ -2168,7 +1219,6 @@
         <w:noProof/>
         <w:sz w:val="24"/>
         <w:szCs w:val="24"/>
-        <w:lang w:eastAsia="en-US"/>
       </w:rPr>
       <w:drawing>
         <wp:inline distT="0" distB="0" distL="0" distR="0" wp14:anchorId="7632BA00" wp14:editId="13169966">
@@ -2225,7 +1275,7 @@
 </file>
 
 <file path=word/numbering.xml><?xml version="1.0" encoding="utf-8"?>
-<w:numbering xmlns:wpc="http://schemas.microsoft.com/office/word/2010/wordprocessingCanvas" xmlns:cx="http://schemas.microsoft.com/office/drawing/2014/chartex" xmlns:mc="http://schemas.openxmlformats.org/markup-compatibility/2006" xmlns:o="urn:schemas-microsoft-com:office:office" xmlns:r="http://schemas.openxmlformats.org/officeDocument/2006/relationships" xmlns:m="http://schemas.openxmlformats.org/officeDocument/2006/math" xmlns:v="urn:schemas-microsoft-com:vml" xmlns:wp14="http://schemas.microsoft.com/office/word/2010/wordprocessingDrawing" xmlns:wp="http://schemas.openxmlformats.org/drawingml/2006/wordprocessingDrawing" xmlns:w10="urn:schemas-microsoft-com:office:word" xmlns:w="http://schemas.openxmlformats.org/wordprocessingml/2006/main" xmlns:w14="http://schemas.microsoft.com/office/word/2010/wordml" xmlns:w15="http://schemas.microsoft.com/office/word/2012/wordml" xmlns:w16se="http://schemas.microsoft.com/office/word/2015/wordml/symex" xmlns:wpg="http://schemas.microsoft.com/office/word/2010/wordprocessingGroup" xmlns:wpi="http://schemas.microsoft.com/office/word/2010/wordprocessingInk" xmlns:wne="http://schemas.microsoft.com/office/word/2006/wordml" xmlns:wps="http://schemas.microsoft.com/office/word/2010/wordprocessingShape" mc:Ignorable="w14 w15 w16se wp14">
+<w:numbering xmlns:wpc="http://schemas.microsoft.com/office/word/2010/wordprocessingCanvas" xmlns:cx="http://schemas.microsoft.com/office/drawing/2014/chartex" xmlns:cx1="http://schemas.microsoft.com/office/drawing/2015/9/8/chartex" xmlns:cx2="http://schemas.microsoft.com/office/drawing/2015/10/21/chartex" xmlns:cx3="http://schemas.microsoft.com/office/drawing/2016/5/9/chartex" xmlns:cx4="http://schemas.microsoft.com/office/drawing/2016/5/10/chartex" xmlns:cx5="http://schemas.microsoft.com/office/drawing/2016/5/11/chartex" xmlns:cx6="http://schemas.microsoft.com/office/drawing/2016/5/12/chartex" xmlns:cx7="http://schemas.microsoft.com/office/drawing/2016/5/13/chartex" xmlns:cx8="http://schemas.microsoft.com/office/drawing/2016/5/14/chartex" xmlns:mc="http://schemas.openxmlformats.org/markup-compatibility/2006" xmlns:aink="http://schemas.microsoft.com/office/drawing/2016/ink" xmlns:am3d="http://schemas.microsoft.com/office/drawing/2017/model3d" xmlns:o="urn:schemas-microsoft-com:office:office" xmlns:oel="http://schemas.microsoft.com/office/2019/extlst" xmlns:r="http://schemas.openxmlformats.org/officeDocument/2006/relationships" xmlns:m="http://schemas.openxmlformats.org/officeDocument/2006/math" xmlns:v="urn:schemas-microsoft-com:vml" xmlns:wp14="http://schemas.microsoft.com/office/word/2010/wordprocessingDrawing" xmlns:wp="http://schemas.openxmlformats.org/drawingml/2006/wordprocessingDrawing" xmlns:w10="urn:schemas-microsoft-com:office:word" xmlns:w="http://schemas.openxmlformats.org/wordprocessingml/2006/main" xmlns:w14="http://schemas.microsoft.com/office/word/2010/wordml" xmlns:w15="http://schemas.microsoft.com/office/word/2012/wordml" xmlns:w16cex="http://schemas.microsoft.com/office/word/2018/wordml/cex" xmlns:w16cid="http://schemas.microsoft.com/office/word/2016/wordml/cid" xmlns:w16="http://schemas.microsoft.com/office/word/2018/wordml" xmlns:w16du="http://schemas.microsoft.com/office/word/2023/wordml/word16du" xmlns:w16sdtdh="http://schemas.microsoft.com/office/word/2020/wordml/sdtdatahash" xmlns:w16sdtfl="http://schemas.microsoft.com/office/word/2024/wordml/sdtformatlock" xmlns:w16se="http://schemas.microsoft.com/office/word/2015/wordml/symex" xmlns:wpg="http://schemas.microsoft.com/office/word/2010/wordprocessingGroup" xmlns:wpi="http://schemas.microsoft.com/office/word/2010/wordprocessingInk" xmlns:wne="http://schemas.microsoft.com/office/word/2006/wordml" xmlns:wps="http://schemas.microsoft.com/office/word/2010/wordprocessingShape" mc:Ignorable="w14 w15 w16se w16cid w16 w16cex w16sdtdh w16sdtfl w16du wp14">
   <w:abstractNum w:abstractNumId="0" w15:restartNumberingAfterBreak="0">
     <w:nsid w:val="4E3626BD"/>
     <w:multiLevelType w:val="hybridMultilevel"/>
@@ -2236,7 +1286,7 @@
       <w:lvlText w:val="%1."/>
       <w:lvlJc w:val="left"/>
       <w:pPr>
-        <w:ind w:left="1494" w:hanging="360"/>
+        <w:ind w:left="1860" w:hanging="360"/>
       </w:pPr>
       <w:rPr>
         <w:rFonts w:ascii="Times New Roman" w:eastAsiaTheme="minorEastAsia" w:hAnsi="Times New Roman" w:cs="Times New Roman"/>
@@ -2248,7 +1298,7 @@
       <w:lvlText w:val="%2."/>
       <w:lvlJc w:val="left"/>
       <w:pPr>
-        <w:ind w:left="2214" w:hanging="360"/>
+        <w:ind w:left="2580" w:hanging="360"/>
       </w:pPr>
     </w:lvl>
     <w:lvl w:ilvl="2" w:tplc="0409001B" w:tentative="1">
@@ -2257,7 +1307,7 @@
       <w:lvlText w:val="%3."/>
       <w:lvlJc w:val="right"/>
       <w:pPr>
-        <w:ind w:left="2934" w:hanging="180"/>
+        <w:ind w:left="3300" w:hanging="180"/>
       </w:pPr>
     </w:lvl>
     <w:lvl w:ilvl="3" w:tplc="0409000F" w:tentative="1">
@@ -2266,7 +1316,7 @@
       <w:lvlText w:val="%4."/>
       <w:lvlJc w:val="left"/>
       <w:pPr>
-        <w:ind w:left="3654" w:hanging="360"/>
+        <w:ind w:left="4020" w:hanging="360"/>
       </w:pPr>
     </w:lvl>
     <w:lvl w:ilvl="4" w:tplc="04090019" w:tentative="1">
@@ -2275,7 +1325,7 @@
       <w:lvlText w:val="%5."/>
       <w:lvlJc w:val="left"/>
       <w:pPr>
-        <w:ind w:left="4374" w:hanging="360"/>
+        <w:ind w:left="4740" w:hanging="360"/>
       </w:pPr>
     </w:lvl>
     <w:lvl w:ilvl="5" w:tplc="0409001B" w:tentative="1">
@@ -2284,7 +1334,7 @@
       <w:lvlText w:val="%6."/>
       <w:lvlJc w:val="right"/>
       <w:pPr>
-        <w:ind w:left="5094" w:hanging="180"/>
+        <w:ind w:left="5460" w:hanging="180"/>
       </w:pPr>
     </w:lvl>
     <w:lvl w:ilvl="6" w:tplc="0409000F" w:tentative="1">
@@ -2293,7 +1343,7 @@
       <w:lvlText w:val="%7."/>
       <w:lvlJc w:val="left"/>
       <w:pPr>
-        <w:ind w:left="5814" w:hanging="360"/>
+        <w:ind w:left="6180" w:hanging="360"/>
       </w:pPr>
     </w:lvl>
     <w:lvl w:ilvl="7" w:tplc="04090019" w:tentative="1">
@@ -2302,7 +1352,7 @@
       <w:lvlText w:val="%8."/>
       <w:lvlJc w:val="left"/>
       <w:pPr>
-        <w:ind w:left="6534" w:hanging="360"/>
+        <w:ind w:left="6900" w:hanging="360"/>
       </w:pPr>
     </w:lvl>
     <w:lvl w:ilvl="8" w:tplc="0409001B" w:tentative="1">
@@ -2311,7 +1361,7 @@
       <w:lvlText w:val="%9."/>
       <w:lvlJc w:val="right"/>
       <w:pPr>
-        <w:ind w:left="7254" w:hanging="180"/>
+        <w:ind w:left="7620" w:hanging="180"/>
       </w:pPr>
     </w:lvl>
   </w:abstractNum>
@@ -2539,20 +1589,20 @@
       </w:rPr>
     </w:lvl>
   </w:abstractNum>
-  <w:num w:numId="1">
+  <w:num w:numId="1" w16cid:durableId="887183028">
     <w:abstractNumId w:val="2"/>
   </w:num>
-  <w:num w:numId="2">
+  <w:num w:numId="2" w16cid:durableId="637227717">
     <w:abstractNumId w:val="1"/>
   </w:num>
-  <w:num w:numId="3">
+  <w:num w:numId="3" w16cid:durableId="735666519">
     <w:abstractNumId w:val="0"/>
   </w:num>
 </w:numbering>
 </file>
 
 <file path=word/styles.xml><?xml version="1.0" encoding="utf-8"?>
-<w:styles xmlns:mc="http://schemas.openxmlformats.org/markup-compatibility/2006" xmlns:r="http://schemas.openxmlformats.org/officeDocument/2006/relationships" xmlns:w="http://schemas.openxmlformats.org/wordprocessingml/2006/main" xmlns:w14="http://schemas.microsoft.com/office/word/2010/wordml" xmlns:w15="http://schemas.microsoft.com/office/word/2012/wordml" xmlns:w16se="http://schemas.microsoft.com/office/word/2015/wordml/symex" mc:Ignorable="w14 w15 w16se">
+<w:styles xmlns:mc="http://schemas.openxmlformats.org/markup-compatibility/2006" xmlns:r="http://schemas.openxmlformats.org/officeDocument/2006/relationships" xmlns:w="http://schemas.openxmlformats.org/wordprocessingml/2006/main" xmlns:w14="http://schemas.microsoft.com/office/word/2010/wordml" xmlns:w15="http://schemas.microsoft.com/office/word/2012/wordml" xmlns:w16cex="http://schemas.microsoft.com/office/word/2018/wordml/cex" xmlns:w16cid="http://schemas.microsoft.com/office/word/2016/wordml/cid" xmlns:w16="http://schemas.microsoft.com/office/word/2018/wordml" xmlns:w16du="http://schemas.microsoft.com/office/word/2023/wordml/word16du" xmlns:w16sdtdh="http://schemas.microsoft.com/office/word/2020/wordml/sdtdatahash" xmlns:w16sdtfl="http://schemas.microsoft.com/office/word/2024/wordml/sdtformatlock" xmlns:w16se="http://schemas.microsoft.com/office/word/2015/wordml/symex" mc:Ignorable="w14 w15 w16se w16cid w16 w16cex w16sdtdh w16sdtfl w16du">
   <w:docDefaults>
     <w:rPrDefault>
       <w:rPr>
@@ -2568,7 +1618,7 @@
       </w:pPr>
     </w:pPrDefault>
   </w:docDefaults>
-  <w:latentStyles w:defLockedState="0" w:defUIPriority="99" w:defSemiHidden="0" w:defUnhideWhenUsed="0" w:defQFormat="0" w:count="371">
+  <w:latentStyles w:defLockedState="0" w:defUIPriority="99" w:defSemiHidden="0" w:defUnhideWhenUsed="0" w:defQFormat="0" w:count="376">
     <w:lsdException w:name="Normal" w:uiPriority="0" w:qFormat="1"/>
     <w:lsdException w:name="heading 1" w:uiPriority="9" w:qFormat="1"/>
     <w:lsdException w:name="heading 2" w:semiHidden="1" w:uiPriority="9" w:unhideWhenUsed="1" w:qFormat="1"/>
@@ -2940,6 +1990,11 @@
     <w:lsdException w:name="List Table 5 Dark Accent 6" w:uiPriority="50"/>
     <w:lsdException w:name="List Table 6 Colorful Accent 6" w:uiPriority="51"/>
     <w:lsdException w:name="List Table 7 Colorful Accent 6" w:uiPriority="52"/>
+    <w:lsdException w:name="Mention" w:semiHidden="1" w:unhideWhenUsed="1"/>
+    <w:lsdException w:name="Smart Hyperlink" w:semiHidden="1" w:unhideWhenUsed="1"/>
+    <w:lsdException w:name="Hashtag" w:semiHidden="1" w:unhideWhenUsed="1"/>
+    <w:lsdException w:name="Unresolved Mention" w:semiHidden="1" w:unhideWhenUsed="1"/>
+    <w:lsdException w:name="Smart Link" w:semiHidden="1" w:unhideWhenUsed="1"/>
   </w:latentStyles>
   <w:style w:type="paragraph" w:default="1" w:styleId="Normal">
     <w:name w:val="Normal"/>

</xml_diff>

<commit_message>
FIX CONTRACT & SHOP VIEW
</commit_message>
<xml_diff>
--- a/storage/app/templates/bbnt_template.docx
+++ b/storage/app/templates/bbnt_template.docx
@@ -577,7 +577,7 @@
       </w:tblGrid>
       <w:tr>
         <w:trPr>
-          <w:trHeight w:val="386"/>
+          <w:trHeight w:val="296"/>
           <w:jc w:val="center"/>
         </w:trPr>
         <w:tc>
@@ -985,6 +985,14 @@
           <w:sz w:val="24"/>
           <w:szCs w:val="24"/>
         </w:rPr>
+        <w:t xml:space="preserve"> </w:t>
+      </w:r>
+      <w:r>
+        <w:rPr>
+          <w:rFonts w:ascii="Times New Roman" w:hAnsi="Times New Roman" w:cs="Times New Roman"/>
+          <w:sz w:val="24"/>
+          <w:szCs w:val="24"/>
+        </w:rPr>
         <w:t>Tình trạng thiết bị:………………………………………………………………………………………………………………………….</w:t>
       </w:r>
     </w:p>
@@ -1009,6 +1017,14 @@
           <w:sz w:val="24"/>
           <w:szCs w:val="24"/>
         </w:rPr>
+        <w:t xml:space="preserve"> </w:t>
+      </w:r>
+      <w:r>
+        <w:rPr>
+          <w:rFonts w:ascii="Times New Roman" w:hAnsi="Times New Roman" w:cs="Times New Roman"/>
+          <w:sz w:val="24"/>
+          <w:szCs w:val="24"/>
+        </w:rPr>
         <w:t>Xác nhận hiện trạng xung quan</w:t>
       </w:r>
       <w:r>
@@ -1049,6 +1065,14 @@
           <w:sz w:val="24"/>
           <w:szCs w:val="24"/>
         </w:rPr>
+        <w:t xml:space="preserve"> </w:t>
+      </w:r>
+      <w:r>
+        <w:rPr>
+          <w:rFonts w:ascii="Times New Roman" w:hAnsi="Times New Roman" w:cs="Times New Roman"/>
+          <w:sz w:val="24"/>
+          <w:szCs w:val="24"/>
+        </w:rPr>
         <w:t>Xác nhận đạt tiêu chuẩn kỹ thuật, an toàn điện: Đảm bảo</w:t>
       </w:r>
     </w:p>
@@ -1067,6 +1091,14 @@
           <w:szCs w:val="24"/>
         </w:rPr>
       </w:pPr>
+      <w:r>
+        <w:rPr>
+          <w:rFonts w:ascii="Times New Roman" w:hAnsi="Times New Roman" w:cs="Times New Roman"/>
+          <w:sz w:val="24"/>
+          <w:szCs w:val="24"/>
+        </w:rPr>
+        <w:t xml:space="preserve"> </w:t>
+      </w:r>
       <w:r>
         <w:rPr>
           <w:rFonts w:ascii="Times New Roman" w:hAnsi="Times New Roman" w:cs="Times New Roman"/>
@@ -1286,7 +1318,7 @@
       <w:lvlText w:val="%1."/>
       <w:lvlJc w:val="left"/>
       <w:pPr>
-        <w:ind w:left="1860" w:hanging="360"/>
+        <w:ind w:left="1494" w:hanging="360"/>
       </w:pPr>
       <w:rPr>
         <w:rFonts w:ascii="Times New Roman" w:eastAsiaTheme="minorEastAsia" w:hAnsi="Times New Roman" w:cs="Times New Roman"/>
@@ -1298,7 +1330,7 @@
       <w:lvlText w:val="%2."/>
       <w:lvlJc w:val="left"/>
       <w:pPr>
-        <w:ind w:left="2580" w:hanging="360"/>
+        <w:ind w:left="2214" w:hanging="360"/>
       </w:pPr>
     </w:lvl>
     <w:lvl w:ilvl="2" w:tplc="0409001B" w:tentative="1">
@@ -1307,7 +1339,7 @@
       <w:lvlText w:val="%3."/>
       <w:lvlJc w:val="right"/>
       <w:pPr>
-        <w:ind w:left="3300" w:hanging="180"/>
+        <w:ind w:left="2934" w:hanging="180"/>
       </w:pPr>
     </w:lvl>
     <w:lvl w:ilvl="3" w:tplc="0409000F" w:tentative="1">
@@ -1316,7 +1348,7 @@
       <w:lvlText w:val="%4."/>
       <w:lvlJc w:val="left"/>
       <w:pPr>
-        <w:ind w:left="4020" w:hanging="360"/>
+        <w:ind w:left="3654" w:hanging="360"/>
       </w:pPr>
     </w:lvl>
     <w:lvl w:ilvl="4" w:tplc="04090019" w:tentative="1">
@@ -1325,7 +1357,7 @@
       <w:lvlText w:val="%5."/>
       <w:lvlJc w:val="left"/>
       <w:pPr>
-        <w:ind w:left="4740" w:hanging="360"/>
+        <w:ind w:left="4374" w:hanging="360"/>
       </w:pPr>
     </w:lvl>
     <w:lvl w:ilvl="5" w:tplc="0409001B" w:tentative="1">
@@ -1334,7 +1366,7 @@
       <w:lvlText w:val="%6."/>
       <w:lvlJc w:val="right"/>
       <w:pPr>
-        <w:ind w:left="5460" w:hanging="180"/>
+        <w:ind w:left="5094" w:hanging="180"/>
       </w:pPr>
     </w:lvl>
     <w:lvl w:ilvl="6" w:tplc="0409000F" w:tentative="1">
@@ -1343,7 +1375,7 @@
       <w:lvlText w:val="%7."/>
       <w:lvlJc w:val="left"/>
       <w:pPr>
-        <w:ind w:left="6180" w:hanging="360"/>
+        <w:ind w:left="5814" w:hanging="360"/>
       </w:pPr>
     </w:lvl>
     <w:lvl w:ilvl="7" w:tplc="04090019" w:tentative="1">
@@ -1352,7 +1384,7 @@
       <w:lvlText w:val="%8."/>
       <w:lvlJc w:val="left"/>
       <w:pPr>
-        <w:ind w:left="6900" w:hanging="360"/>
+        <w:ind w:left="6534" w:hanging="360"/>
       </w:pPr>
     </w:lvl>
     <w:lvl w:ilvl="8" w:tplc="0409001B" w:tentative="1">
@@ -1361,7 +1393,7 @@
       <w:lvlText w:val="%9."/>
       <w:lvlJc w:val="right"/>
       <w:pPr>
-        <w:ind w:left="7620" w:hanging="180"/>
+        <w:ind w:left="7254" w:hanging="180"/>
       </w:pPr>
     </w:lvl>
   </w:abstractNum>

</xml_diff>